<commit_message>
Replace Streamlit with native Desktop GUI (Tkinter + Matplotlib); update main.py, README, requirements, and Word report
</commit_message>
<xml_diff>
--- a/TR-09_ITMS_Project_Report.docx
+++ b/TR-09_ITMS_Project_Report.docx
@@ -2764,7 +2764,7 @@
                 <w:color w:val="2D3748"/>
                 <w:sz w:val="18"/>
               </w:rPr>
-              <w:t>Interactive Streamlit Web Dashboard Interface</w:t>
+              <w:t>TR-09 Native Desktop Inspection Interface</w:t>
             </w:r>
           </w:p>
         </w:tc>
@@ -6121,7 +6121,7 @@
         <w:br/>
         <w:t>• Telemetry: MQTT 5 over LTE, CBOR-encoded payloads averaging 280 bytes per event.</w:t>
         <w:br/>
-        <w:t>• Cloud: InfluxDB 3 for time series, Cloudflare R2 for raw frames, Grafana 11 / Streamlit for dashboards.</w:t>
+        <w:t>• Cloud: InfluxDB 3 for time series, Cloudflare R2 for raw frames, Grafana 11 / Native Desktop Application for dashboards.</w:t>
         <w:br/>
         <w:t>• Local-First Resilience: 32 GB on-device buffer, auto-resync when connectivity returns.</w:t>
         <w:br/>
@@ -10920,7 +10920,7 @@
                 <w:color w:val="2D3748"/>
                 <w:sz w:val="18"/>
               </w:rPr>
-              <w:t>main.py</w:t>
+              <w:t>gui_app.py</w:t>
             </w:r>
           </w:p>
         </w:tc>
@@ -10945,7 +10945,7 @@
                 <w:color w:val="2D3748"/>
                 <w:sz w:val="18"/>
               </w:rPr>
-              <w:t>CLI Runner</w:t>
+              <w:t>Desktop Inspection GUI</w:t>
             </w:r>
           </w:p>
         </w:tc>
@@ -10970,7 +10970,7 @@
                 <w:color w:val="2D3748"/>
                 <w:sz w:val="18"/>
               </w:rPr>
-              <w:t>Terminal simulation of 1.5 km inspection run with colored event log</w:t>
+              <w:t>Native Tkinter + Matplotlib interface with live gauge curve, camera view &amp; event logs</w:t>
             </w:r>
           </w:p>
         </w:tc>
@@ -10998,7 +10998,7 @@
                 <w:color w:val="2D3748"/>
                 <w:sz w:val="18"/>
               </w:rPr>
-              <w:t>app.py</w:t>
+              <w:t>main.py</w:t>
             </w:r>
           </w:p>
         </w:tc>
@@ -11023,7 +11023,7 @@
                 <w:color w:val="2D3748"/>
                 <w:sz w:val="18"/>
               </w:rPr>
-              <w:t>Streamlit Dashboard</w:t>
+              <w:t>Primary Entry Point</w:t>
             </w:r>
           </w:p>
         </w:tc>
@@ -11048,7 +11048,7 @@
                 <w:color w:val="2D3748"/>
                 <w:sz w:val="18"/>
               </w:rPr>
-              <w:t>Interactive web UI with live geometry curves, defect gallery, and CSV export</w:t>
+              <w:t>Launches Native Desktop GUI by default, or runs CLI mode via --cli</w:t>
             </w:r>
           </w:p>
         </w:tc>
@@ -11146,9 +11146,9 @@
               <w:br/>
               <w:t xml:space="preserve">  pip install -r requirements.txt</w:t>
               <w:br/>
-              <w:t xml:space="preserve">  python main.py             # Runs CLI simulation</w:t>
+              <w:t xml:space="preserve">  python main.py             # Launches Native Desktop Inspection GUI</w:t>
               <w:br/>
-              <w:t xml:space="preserve">  streamlit run app.py       # Launches graphical dashboard</w:t>
+              <w:t xml:space="preserve">  python main.py --cli       # Fast terminal simulation mode</w:t>
             </w:r>
           </w:p>
         </w:tc>

</xml_diff>